<commit_message>
Revise first proposal from document comments
</commit_message>
<xml_diff>
--- a/docs/DKU-SWAI_1차_기획서.docx
+++ b/docs/DKU-SWAI_1차_기획서.docx
@@ -8,7 +8,7 @@
         <w:spacing w:after="100" w:before="0" w:line="260"/>
       </w:pPr>
       <w:r>
-        <w:t xml:space="preserve">단국대학교 SW·AI입문(SW) 2차 팀 프로젝트</w:t>
+        <w:t xml:space="preserve">단국대학교 SW·AI입문(SW) 2차 과제</w:t>
       </w:r>
     </w:p>
     <w:p>
@@ -18,22 +18,6 @@
       </w:pPr>
       <w:r>
         <w:t xml:space="preserve">DKU-SWAI 1차 기획서</w:t>
-      </w:r>
-    </w:p>
-    <w:p>
-      <w:pPr>
-        <w:pStyle w:val="Normal"/>
-        <w:spacing w:after="220" w:before="0" w:line="260"/>
-      </w:pPr>
-      <w:r>
-        <w:rPr>
-          <w:b/>
-          <w:bCs/>
-          <w:color w:val="17365D"/>
-          <w:sz w:val="25"/>
-          <w:szCs w:val="25"/>
-        </w:rPr>
-        <w:t xml:space="preserve">Kaggle 폐암 설문 데이터 기반 분류 모델</w:t>
       </w:r>
     </w:p>
     <w:tbl>
@@ -137,62 +121,6 @@
                 <w:sz w:val="19"/>
                 <w:szCs w:val="19"/>
               </w:rPr>
-              <w:t xml:space="preserve">팀 / 작성 기준</w:t>
-            </w:r>
-          </w:p>
-        </w:tc>
-        <w:tc>
-          <w:tcPr>
-            <w:tcW w:type="dxa" w:w="7460"/>
-            <w:tcMar>
-              <w:top w:type="dxa" w:w="95"/>
-              <w:left w:type="dxa" w:w="115"/>
-              <w:bottom w:type="dxa" w:w="95"/>
-              <w:right w:type="dxa" w:w="115"/>
-            </w:tcMar>
-          </w:tcPr>
-          <w:p>
-            <w:pPr>
-              <w:spacing w:after="0" w:line="240"/>
-            </w:pPr>
-            <w:r>
-              <w:rPr>
-                <w:rFonts w:ascii="Malgun Gothic" w:cs="Malgun Gothic" w:eastAsia="Malgun Gothic" w:hAnsi="Malgun Gothic"/>
-                <w:b w:val="false"/>
-                <w:bCs w:val="false"/>
-                <w:color w:val="222222"/>
-                <w:sz w:val="19"/>
-                <w:szCs w:val="19"/>
-              </w:rPr>
-              <w:t xml:space="preserve">4조 · 2026년 10월 16일 · GitHub main 브랜치 기준</w:t>
-            </w:r>
-          </w:p>
-        </w:tc>
-      </w:tr>
-      <w:tr>
-        <w:tc>
-          <w:tcPr>
-            <w:tcW w:type="dxa" w:w="1900"/>
-            <w:tcMar>
-              <w:top w:type="dxa" w:w="95"/>
-              <w:left w:type="dxa" w:w="115"/>
-              <w:bottom w:type="dxa" w:w="95"/>
-              <w:right w:type="dxa" w:w="115"/>
-            </w:tcMar>
-          </w:tcPr>
-          <w:p>
-            <w:pPr>
-              <w:spacing w:after="0" w:line="240"/>
-            </w:pPr>
-            <w:r>
-              <w:rPr>
-                <w:rFonts w:ascii="Malgun Gothic" w:cs="Malgun Gothic" w:eastAsia="Malgun Gothic" w:hAnsi="Malgun Gothic"/>
-                <w:b w:val="false"/>
-                <w:bCs w:val="false"/>
-                <w:color w:val="222222"/>
-                <w:sz w:val="19"/>
-                <w:szCs w:val="19"/>
-              </w:rPr>
               <w:t xml:space="preserve">팀 구성</w:t>
             </w:r>
           </w:p>
@@ -298,7 +226,7 @@
         <w:spacing w:after="90" w:before="0" w:line="260"/>
       </w:pPr>
       <w:r>
-        <w:t xml:space="preserve">Kaggle의 폐암 설문 데이터를 사용해 응답자의 설문 특성으로 LUNG_CANCER(YES/NO)를 분류하는 교육용 Python 프로그램을 개발한다. CSV 검증부터 전처리, 모델 학습, 평가, 결과 저장까지 한 번의 명령으로 재현할 수 있도록 한다.</w:t>
+        <w:t xml:space="preserve">Python으로 폐암 설문 응답을 분석해 폐암 여부를 분류하는 폐암 진단 모델을 개발한다. 응답 항목을 정리한 뒤 모델을 학습하고, 평가용 데이터에 대한 예측 결과와 성능 지표를 확인할 수 있도록 구현한다.</w:t>
       </w:r>
     </w:p>
     <w:p>
@@ -322,7 +250,7 @@
         <w:spacing w:after="55" w:line="245"/>
       </w:pPr>
       <w:r>
-        <w:t xml:space="preserve">목표: 기본 문법과 데이터 분석을 함께 적용하고, 분류 모델의 성능을 여러 지표로 설명한다.</w:t>
+        <w:t xml:space="preserve">설문 항목의 값과 형식을 검증하고 중복 응답을 제거해 일관된 학습 데이터를 만든다.</w:t>
       </w:r>
     </w:p>
     <w:p>
@@ -336,7 +264,7 @@
         <w:spacing w:after="55" w:line="245"/>
       </w:pPr>
       <w:r>
-        <w:t xml:space="preserve">1차 결과물: 기능 정의, 실행 흐름, 개발 환경, 역할 분담을 담은 기획서.</w:t>
+        <w:t xml:space="preserve">로지스틱 회귀 모델을 기준으로 폐암 YES 예측 성능을 정밀도·재현율·F1과 혼동 행렬로 확인한다.</w:t>
       </w:r>
     </w:p>
     <w:p>
@@ -350,7 +278,7 @@
         <w:spacing w:after="55" w:line="245"/>
       </w:pPr>
       <w:r>
-        <w:t xml:space="preserve">최종 결과물: 실행 가능한 소스코드·데이터, 발표 자료, A4 2장 이내 요약 보고서가 포함된 ZIP.</w:t>
+        <w:t xml:space="preserve">동일한 데이터와 실행 절차로 모델 학습·평가 결과를 다시 만들 수 있는 코드와 결과 파일을 완성한다.</w:t>
       </w:r>
     </w:p>
     <w:p>
@@ -380,62 +308,57 @@
         <w:gridCol w:w="7210"/>
       </w:tblGrid>
       <w:tr>
-        <w:trPr>
-          <w:tblHeader/>
-        </w:trPr>
         <w:tc>
           <w:tcPr>
             <w:tcW w:type="dxa" w:w="2150"/>
-            <w:shd w:fill="17365D" w:val="clear"/>
-            <w:tcMar>
-              <w:top w:type="dxa" w:w="95"/>
-              <w:left w:type="dxa" w:w="115"/>
-              <w:bottom w:type="dxa" w:w="95"/>
-              <w:right w:type="dxa" w:w="115"/>
-            </w:tcMar>
-          </w:tcPr>
-          <w:p>
-            <w:pPr>
-              <w:spacing w:after="0" w:line="240"/>
-            </w:pPr>
-            <w:r>
-              <w:rPr>
-                <w:rFonts w:ascii="Malgun Gothic" w:cs="Malgun Gothic" w:eastAsia="Malgun Gothic" w:hAnsi="Malgun Gothic"/>
-                <w:b/>
-                <w:bCs/>
-                <w:color w:val="FFFFFF"/>
-                <w:sz w:val="19"/>
-                <w:szCs w:val="19"/>
-              </w:rPr>
-              <w:t xml:space="preserve">기능</w:t>
+            <w:tcMar>
+              <w:top w:type="dxa" w:w="95"/>
+              <w:left w:type="dxa" w:w="115"/>
+              <w:bottom w:type="dxa" w:w="95"/>
+              <w:right w:type="dxa" w:w="115"/>
+            </w:tcMar>
+          </w:tcPr>
+          <w:p>
+            <w:pPr>
+              <w:spacing w:after="0" w:line="240"/>
+            </w:pPr>
+            <w:r>
+              <w:rPr>
+                <w:rFonts w:ascii="Malgun Gothic" w:cs="Malgun Gothic" w:eastAsia="Malgun Gothic" w:hAnsi="Malgun Gothic"/>
+                <w:b w:val="false"/>
+                <w:bCs w:val="false"/>
+                <w:color w:val="222222"/>
+                <w:sz w:val="19"/>
+                <w:szCs w:val="19"/>
+              </w:rPr>
+              <w:t xml:space="preserve">데이터 입력·검증</w:t>
             </w:r>
           </w:p>
         </w:tc>
         <w:tc>
           <w:tcPr>
             <w:tcW w:type="dxa" w:w="7210"/>
-            <w:shd w:fill="17365D" w:val="clear"/>
-            <w:tcMar>
-              <w:top w:type="dxa" w:w="95"/>
-              <w:left w:type="dxa" w:w="115"/>
-              <w:bottom w:type="dxa" w:w="95"/>
-              <w:right w:type="dxa" w:w="115"/>
-            </w:tcMar>
-          </w:tcPr>
-          <w:p>
-            <w:pPr>
-              <w:spacing w:after="0" w:line="240"/>
-            </w:pPr>
-            <w:r>
-              <w:rPr>
-                <w:rFonts w:ascii="Malgun Gothic" w:cs="Malgun Gothic" w:eastAsia="Malgun Gothic" w:hAnsi="Malgun Gothic"/>
-                <w:b/>
-                <w:bCs/>
-                <w:color w:val="FFFFFF"/>
-                <w:sz w:val="19"/>
-                <w:szCs w:val="19"/>
-              </w:rPr>
-              <w:t xml:space="preserve">입력·처리·출력</w:t>
+            <w:tcMar>
+              <w:top w:type="dxa" w:w="95"/>
+              <w:left w:type="dxa" w:w="115"/>
+              <w:bottom w:type="dxa" w:w="95"/>
+              <w:right w:type="dxa" w:w="115"/>
+            </w:tcMar>
+          </w:tcPr>
+          <w:p>
+            <w:pPr>
+              <w:spacing w:after="0" w:line="240"/>
+            </w:pPr>
+            <w:r>
+              <w:rPr>
+                <w:rFonts w:ascii="Malgun Gothic" w:cs="Malgun Gothic" w:eastAsia="Malgun Gothic" w:hAnsi="Malgun Gothic"/>
+                <w:b w:val="false"/>
+                <w:bCs w:val="false"/>
+                <w:color w:val="222222"/>
+                <w:sz w:val="19"/>
+                <w:szCs w:val="19"/>
+              </w:rPr>
+              <w:t xml:space="preserve">기본 CSV 또는 --data로 지정한 CSV를 읽고 필수 열, 결측값, 허용값을 검사</w:t>
             </w:r>
           </w:p>
         </w:tc>
@@ -464,7 +387,7 @@
                 <w:sz w:val="19"/>
                 <w:szCs w:val="19"/>
               </w:rPr>
-              <w:t xml:space="preserve">데이터 입력·검증</w:t>
+              <w:t xml:space="preserve">전처리</w:t>
             </w:r>
           </w:p>
         </w:tc>
@@ -491,7 +414,7 @@
                 <w:sz w:val="19"/>
                 <w:szCs w:val="19"/>
               </w:rPr>
-              <w:t xml:space="preserve">기본 CSV 또는 --data로 지정한 CSV를 읽고 필수 열, 결측값, 허용값을 검사</w:t>
+              <w:t xml:space="preserve">열 이름 공백 정리, 완전 중복 행 제거, 성별·설문 응답·정답을 숫자로 변환</w:t>
             </w:r>
           </w:p>
         </w:tc>
@@ -520,7 +443,7 @@
                 <w:sz w:val="19"/>
                 <w:szCs w:val="19"/>
               </w:rPr>
-              <w:t xml:space="preserve">전처리</w:t>
+              <w:t xml:space="preserve">학습</w:t>
             </w:r>
           </w:p>
         </w:tc>
@@ -547,7 +470,7 @@
                 <w:sz w:val="19"/>
                 <w:szCs w:val="19"/>
               </w:rPr>
-              <w:t xml:space="preserve">열 이름 공백 정리, 완전 중복 행 제거, 성별·설문 응답·정답을 숫자로 변환</w:t>
+              <w:t xml:space="preserve">정답 비율을 유지한 80:20 분할 후 학습 데이터에만 표준화 적합; 로지스틱 회귀 학습</w:t>
             </w:r>
           </w:p>
         </w:tc>
@@ -576,62 +499,6 @@
                 <w:sz w:val="19"/>
                 <w:szCs w:val="19"/>
               </w:rPr>
-              <w:t xml:space="preserve">학습</w:t>
-            </w:r>
-          </w:p>
-        </w:tc>
-        <w:tc>
-          <w:tcPr>
-            <w:tcW w:type="dxa" w:w="7210"/>
-            <w:tcMar>
-              <w:top w:type="dxa" w:w="95"/>
-              <w:left w:type="dxa" w:w="115"/>
-              <w:bottom w:type="dxa" w:w="95"/>
-              <w:right w:type="dxa" w:w="115"/>
-            </w:tcMar>
-          </w:tcPr>
-          <w:p>
-            <w:pPr>
-              <w:spacing w:after="0" w:line="240"/>
-            </w:pPr>
-            <w:r>
-              <w:rPr>
-                <w:rFonts w:ascii="Malgun Gothic" w:cs="Malgun Gothic" w:eastAsia="Malgun Gothic" w:hAnsi="Malgun Gothic"/>
-                <w:b w:val="false"/>
-                <w:bCs w:val="false"/>
-                <w:color w:val="222222"/>
-                <w:sz w:val="19"/>
-                <w:szCs w:val="19"/>
-              </w:rPr>
-              <w:t xml:space="preserve">정답 비율을 유지한 80:20 분할 후 학습 데이터에만 표준화 적합; 로지스틱 회귀 학습</w:t>
-            </w:r>
-          </w:p>
-        </w:tc>
-      </w:tr>
-      <w:tr>
-        <w:tc>
-          <w:tcPr>
-            <w:tcW w:type="dxa" w:w="2150"/>
-            <w:tcMar>
-              <w:top w:type="dxa" w:w="95"/>
-              <w:left w:type="dxa" w:w="115"/>
-              <w:bottom w:type="dxa" w:w="95"/>
-              <w:right w:type="dxa" w:w="115"/>
-            </w:tcMar>
-          </w:tcPr>
-          <w:p>
-            <w:pPr>
-              <w:spacing w:after="0" w:line="240"/>
-            </w:pPr>
-            <w:r>
-              <w:rPr>
-                <w:rFonts w:ascii="Malgun Gothic" w:cs="Malgun Gothic" w:eastAsia="Malgun Gothic" w:hAnsi="Malgun Gothic"/>
-                <w:b w:val="false"/>
-                <w:bCs w:val="false"/>
-                <w:color w:val="222222"/>
-                <w:sz w:val="19"/>
-                <w:szCs w:val="19"/>
-              </w:rPr>
               <w:t xml:space="preserve">평가·저장</w:t>
             </w:r>
           </w:p>
@@ -670,15 +537,6 @@
         <w:pStyle w:val="Normal"/>
         <w:spacing w:after="65" w:before="0" w:line="100"/>
       </w:pPr>
-    </w:p>
-    <w:p>
-      <w:pPr>
-        <w:pStyle w:val="Caption"/>
-        <w:spacing w:after="90" w:before="0" w:line="260"/>
-      </w:pPr>
-      <w:r>
-        <w:t xml:space="preserve">범위: 설문 데이터의 분류 실습이다. 출력값을 실제 폐암 진단이나 개인 의료 판단에 사용하지 않는다.</w:t>
-      </w:r>
     </w:p>
     <w:p>
       <w:pPr>
@@ -1441,7 +1299,7 @@
                 <w:sz w:val="19"/>
                 <w:szCs w:val="19"/>
               </w:rPr>
-              <w:t xml:space="preserve">Kaggle “Lung Cancer” 설문 CSV; 정답 열 LUNG_CANCER(YES/NO)</w:t>
+              <w:t xml:space="preserve">data/lung_cancer.csv; 정답 열 LUNG_CANCER(YES/NO)</w:t>
             </w:r>
           </w:p>
         </w:tc>
@@ -1610,6 +1468,62 @@
                 <w:szCs w:val="19"/>
               </w:rPr>
               <w:t xml:space="preserve">StandardScaler + LogisticRegression(class_weight="balanced", random_state=42)</w:t>
+            </w:r>
+          </w:p>
+        </w:tc>
+      </w:tr>
+      <w:tr>
+        <w:tc>
+          <w:tcPr>
+            <w:tcW w:type="dxa" w:w="2100"/>
+            <w:tcMar>
+              <w:top w:type="dxa" w:w="95"/>
+              <w:left w:type="dxa" w:w="115"/>
+              <w:bottom w:type="dxa" w:w="95"/>
+              <w:right w:type="dxa" w:w="115"/>
+            </w:tcMar>
+          </w:tcPr>
+          <w:p>
+            <w:pPr>
+              <w:spacing w:after="0" w:line="240"/>
+            </w:pPr>
+            <w:r>
+              <w:rPr>
+                <w:rFonts w:ascii="Malgun Gothic" w:cs="Malgun Gothic" w:eastAsia="Malgun Gothic" w:hAnsi="Malgun Gothic"/>
+                <w:b w:val="false"/>
+                <w:bCs w:val="false"/>
+                <w:color w:val="222222"/>
+                <w:sz w:val="19"/>
+                <w:szCs w:val="19"/>
+              </w:rPr>
+              <w:t xml:space="preserve">개발 환경</w:t>
+            </w:r>
+          </w:p>
+        </w:tc>
+        <w:tc>
+          <w:tcPr>
+            <w:tcW w:type="dxa" w:w="7260"/>
+            <w:tcMar>
+              <w:top w:type="dxa" w:w="95"/>
+              <w:left w:type="dxa" w:w="115"/>
+              <w:bottom w:type="dxa" w:w="95"/>
+              <w:right w:type="dxa" w:w="115"/>
+            </w:tcMar>
+          </w:tcPr>
+          <w:p>
+            <w:pPr>
+              <w:spacing w:after="0" w:line="240"/>
+            </w:pPr>
+            <w:r>
+              <w:rPr>
+                <w:rFonts w:ascii="Malgun Gothic" w:cs="Malgun Gothic" w:eastAsia="Malgun Gothic" w:hAnsi="Malgun Gothic"/>
+                <w:b w:val="false"/>
+                <w:bCs w:val="false"/>
+                <w:color w:val="222222"/>
+                <w:sz w:val="19"/>
+                <w:szCs w:val="19"/>
+              </w:rPr>
+              <w:t xml:space="preserve">Python 3.10 이상, pandas 2.x, scikit-learn 1.x, joblib 1.x</w:t>
             </w:r>
           </w:p>
         </w:tc>
@@ -1678,35 +1592,7 @@
         <w:spacing w:after="100" w:before="210" w:line="260"/>
       </w:pPr>
       <w:r>
-        <w:t xml:space="preserve">5. 개발 환경 및 검증 기준</w:t>
-      </w:r>
-    </w:p>
-    <w:p>
-      <w:pPr>
-        <w:pStyle w:val="ListParagraph"/>
-        <w:pStyle w:val="Normal"/>
-        <w:numPr>
-          <w:ilvl w:val="0"/>
-          <w:numId w:val="1"/>
-        </w:numPr>
-        <w:spacing w:after="55" w:line="245"/>
-      </w:pPr>
-      <w:r>
-        <w:t xml:space="preserve">Python 3.10 이상, pandas 2.x, scikit-learn 1.x, joblib 1.x; Windows PowerShell 또는 macOS/Linux 터미널.</w:t>
-      </w:r>
-    </w:p>
-    <w:p>
-      <w:pPr>
-        <w:pStyle w:val="ListParagraph"/>
-        <w:pStyle w:val="Normal"/>
-        <w:numPr>
-          <w:ilvl w:val="0"/>
-          <w:numId w:val="1"/>
-        </w:numPr>
-        <w:spacing w:after="55" w:line="245"/>
-      </w:pPr>
-      <w:r>
-        <w:t xml:space="preserve">src/train.py를 기본 데이터로 실행하고, --data 옵션으로 다른 CSV도 입력할 수 있게 한다.</w:t>
+        <w:t xml:space="preserve">5. 검증 기준</w:t>
       </w:r>
     </w:p>
     <w:p>
@@ -2628,16 +2514,6 @@
       </w:pPr>
       <w:r>
         <w:t xml:space="preserve">재현성 문제: 의존성 파일과 실행 방법을 유지하고 최종 제출 전에 다른 PC에서 확인한다.</w:t>
-      </w:r>
-    </w:p>
-    <w:p>
-      <w:pPr>
-        <w:pStyle w:val="Heading 1"/>
-        <w:keepNext/>
-        <w:spacing w:after="100" w:before="210" w:line="260"/>
-      </w:pPr>
-      <w:r>
-        <w:t xml:space="preserve">9. 데이터 출처 및 참고 문헌</w:t>
       </w:r>
     </w:p>
     <w:p>

</xml_diff>

<commit_message>
Restore proposal wording and add visual workflow diagram
</commit_message>
<xml_diff>
--- a/docs/DKU-SWAI_1차_기획서.docx
+++ b/docs/DKU-SWAI_1차_기획서.docx
@@ -8,7 +8,7 @@
         <w:spacing w:after="100" w:before="0" w:line="260"/>
       </w:pPr>
       <w:r>
-        <w:t xml:space="preserve">단국대학교 SW·AI입문(SW) 2차 과제</w:t>
+        <w:t xml:space="preserve">단국대학교 SW·AI입문(SW) 2차 팀 프로젝트</w:t>
       </w:r>
     </w:p>
     <w:p>
@@ -18,6 +18,22 @@
       </w:pPr>
       <w:r>
         <w:t xml:space="preserve">DKU-SWAI 1차 기획서</w:t>
+      </w:r>
+    </w:p>
+    <w:p>
+      <w:pPr>
+        <w:pStyle w:val="Normal"/>
+        <w:spacing w:after="220" w:before="0" w:line="260"/>
+      </w:pPr>
+      <w:r>
+        <w:rPr>
+          <w:b/>
+          <w:bCs/>
+          <w:color w:val="17365D"/>
+          <w:sz w:val="25"/>
+          <w:szCs w:val="25"/>
+        </w:rPr>
+        <w:t xml:space="preserve">Kaggle 폐암 설문 데이터 기반 분류 모델</w:t>
       </w:r>
     </w:p>
     <w:tbl>
@@ -121,6 +137,62 @@
                 <w:sz w:val="19"/>
                 <w:szCs w:val="19"/>
               </w:rPr>
+              <w:t xml:space="preserve">팀 / 작성 기준</w:t>
+            </w:r>
+          </w:p>
+        </w:tc>
+        <w:tc>
+          <w:tcPr>
+            <w:tcW w:type="dxa" w:w="7460"/>
+            <w:tcMar>
+              <w:top w:type="dxa" w:w="95"/>
+              <w:left w:type="dxa" w:w="115"/>
+              <w:bottom w:type="dxa" w:w="95"/>
+              <w:right w:type="dxa" w:w="115"/>
+            </w:tcMar>
+          </w:tcPr>
+          <w:p>
+            <w:pPr>
+              <w:spacing w:after="0" w:line="240"/>
+            </w:pPr>
+            <w:r>
+              <w:rPr>
+                <w:rFonts w:ascii="Malgun Gothic" w:cs="Malgun Gothic" w:eastAsia="Malgun Gothic" w:hAnsi="Malgun Gothic"/>
+                <w:b w:val="false"/>
+                <w:bCs w:val="false"/>
+                <w:color w:val="222222"/>
+                <w:sz w:val="19"/>
+                <w:szCs w:val="19"/>
+              </w:rPr>
+              <w:t xml:space="preserve">4조 · 2026년 10월 16일 · GitHub main 브랜치 기준</w:t>
+            </w:r>
+          </w:p>
+        </w:tc>
+      </w:tr>
+      <w:tr>
+        <w:tc>
+          <w:tcPr>
+            <w:tcW w:type="dxa" w:w="1900"/>
+            <w:tcMar>
+              <w:top w:type="dxa" w:w="95"/>
+              <w:left w:type="dxa" w:w="115"/>
+              <w:bottom w:type="dxa" w:w="95"/>
+              <w:right w:type="dxa" w:w="115"/>
+            </w:tcMar>
+          </w:tcPr>
+          <w:p>
+            <w:pPr>
+              <w:spacing w:after="0" w:line="240"/>
+            </w:pPr>
+            <w:r>
+              <w:rPr>
+                <w:rFonts w:ascii="Malgun Gothic" w:cs="Malgun Gothic" w:eastAsia="Malgun Gothic" w:hAnsi="Malgun Gothic"/>
+                <w:b w:val="false"/>
+                <w:bCs w:val="false"/>
+                <w:color w:val="222222"/>
+                <w:sz w:val="19"/>
+                <w:szCs w:val="19"/>
+              </w:rPr>
               <w:t xml:space="preserve">팀 구성</w:t>
             </w:r>
           </w:p>
@@ -226,7 +298,7 @@
         <w:spacing w:after="90" w:before="0" w:line="260"/>
       </w:pPr>
       <w:r>
-        <w:t xml:space="preserve">Python으로 폐암 설문 응답을 분석해 폐암 여부를 분류하는 폐암 진단 모델을 개발한다. 응답 항목을 정리한 뒤 모델을 학습하고, 평가용 데이터에 대한 예측 결과와 성능 지표를 확인할 수 있도록 구현한다.</w:t>
+        <w:t xml:space="preserve">Kaggle의 폐암 설문 데이터를 사용해 응답자의 설문 특성으로 LUNG_CANCER(YES/NO)를 분류하는 교육용 Python 프로그램을 개발한다. CSV 검증부터 전처리, 모델 학습, 평가, 결과 저장까지 한 번의 명령으로 재현할 수 있도록 한다.</w:t>
       </w:r>
     </w:p>
     <w:p>
@@ -250,7 +322,7 @@
         <w:spacing w:after="55" w:line="245"/>
       </w:pPr>
       <w:r>
-        <w:t xml:space="preserve">설문 항목의 값과 형식을 검증하고 중복 응답을 제거해 일관된 학습 데이터를 만든다.</w:t>
+        <w:t xml:space="preserve">목표: 기본 문법과 데이터 분석을 함께 적용하고, 분류 모델의 성능을 여러 지표로 설명한다.</w:t>
       </w:r>
     </w:p>
     <w:p>
@@ -264,7 +336,7 @@
         <w:spacing w:after="55" w:line="245"/>
       </w:pPr>
       <w:r>
-        <w:t xml:space="preserve">로지스틱 회귀 모델을 기준으로 폐암 YES 예측 성능을 정밀도·재현율·F1과 혼동 행렬로 확인한다.</w:t>
+        <w:t xml:space="preserve">1차 결과물: 기능 정의, 실행 흐름, 개발 환경, 역할 분담을 담은 기획서.</w:t>
       </w:r>
     </w:p>
     <w:p>
@@ -278,7 +350,7 @@
         <w:spacing w:after="55" w:line="245"/>
       </w:pPr>
       <w:r>
-        <w:t xml:space="preserve">동일한 데이터와 실행 절차로 모델 학습·평가 결과를 다시 만들 수 있는 코드와 결과 파일을 완성한다.</w:t>
+        <w:t xml:space="preserve">최종 결과물: 실행 가능한 소스코드·데이터, 발표 자료, A4 2장 이내 요약 보고서가 포함된 ZIP.</w:t>
       </w:r>
     </w:p>
     <w:p>
@@ -308,57 +380,62 @@
         <w:gridCol w:w="7210"/>
       </w:tblGrid>
       <w:tr>
+        <w:trPr>
+          <w:tblHeader/>
+        </w:trPr>
         <w:tc>
           <w:tcPr>
             <w:tcW w:type="dxa" w:w="2150"/>
-            <w:tcMar>
-              <w:top w:type="dxa" w:w="95"/>
-              <w:left w:type="dxa" w:w="115"/>
-              <w:bottom w:type="dxa" w:w="95"/>
-              <w:right w:type="dxa" w:w="115"/>
-            </w:tcMar>
-          </w:tcPr>
-          <w:p>
-            <w:pPr>
-              <w:spacing w:after="0" w:line="240"/>
-            </w:pPr>
-            <w:r>
-              <w:rPr>
-                <w:rFonts w:ascii="Malgun Gothic" w:cs="Malgun Gothic" w:eastAsia="Malgun Gothic" w:hAnsi="Malgun Gothic"/>
-                <w:b w:val="false"/>
-                <w:bCs w:val="false"/>
-                <w:color w:val="222222"/>
-                <w:sz w:val="19"/>
-                <w:szCs w:val="19"/>
-              </w:rPr>
-              <w:t xml:space="preserve">데이터 입력·검증</w:t>
+            <w:shd w:fill="17365D" w:val="clear"/>
+            <w:tcMar>
+              <w:top w:type="dxa" w:w="95"/>
+              <w:left w:type="dxa" w:w="115"/>
+              <w:bottom w:type="dxa" w:w="95"/>
+              <w:right w:type="dxa" w:w="115"/>
+            </w:tcMar>
+          </w:tcPr>
+          <w:p>
+            <w:pPr>
+              <w:spacing w:after="0" w:line="240"/>
+            </w:pPr>
+            <w:r>
+              <w:rPr>
+                <w:rFonts w:ascii="Malgun Gothic" w:cs="Malgun Gothic" w:eastAsia="Malgun Gothic" w:hAnsi="Malgun Gothic"/>
+                <w:b/>
+                <w:bCs/>
+                <w:color w:val="FFFFFF"/>
+                <w:sz w:val="19"/>
+                <w:szCs w:val="19"/>
+              </w:rPr>
+              <w:t xml:space="preserve">기능</w:t>
             </w:r>
           </w:p>
         </w:tc>
         <w:tc>
           <w:tcPr>
             <w:tcW w:type="dxa" w:w="7210"/>
-            <w:tcMar>
-              <w:top w:type="dxa" w:w="95"/>
-              <w:left w:type="dxa" w:w="115"/>
-              <w:bottom w:type="dxa" w:w="95"/>
-              <w:right w:type="dxa" w:w="115"/>
-            </w:tcMar>
-          </w:tcPr>
-          <w:p>
-            <w:pPr>
-              <w:spacing w:after="0" w:line="240"/>
-            </w:pPr>
-            <w:r>
-              <w:rPr>
-                <w:rFonts w:ascii="Malgun Gothic" w:cs="Malgun Gothic" w:eastAsia="Malgun Gothic" w:hAnsi="Malgun Gothic"/>
-                <w:b w:val="false"/>
-                <w:bCs w:val="false"/>
-                <w:color w:val="222222"/>
-                <w:sz w:val="19"/>
-                <w:szCs w:val="19"/>
-              </w:rPr>
-              <w:t xml:space="preserve">기본 CSV 또는 --data로 지정한 CSV를 읽고 필수 열, 결측값, 허용값을 검사</w:t>
+            <w:shd w:fill="17365D" w:val="clear"/>
+            <w:tcMar>
+              <w:top w:type="dxa" w:w="95"/>
+              <w:left w:type="dxa" w:w="115"/>
+              <w:bottom w:type="dxa" w:w="95"/>
+              <w:right w:type="dxa" w:w="115"/>
+            </w:tcMar>
+          </w:tcPr>
+          <w:p>
+            <w:pPr>
+              <w:spacing w:after="0" w:line="240"/>
+            </w:pPr>
+            <w:r>
+              <w:rPr>
+                <w:rFonts w:ascii="Malgun Gothic" w:cs="Malgun Gothic" w:eastAsia="Malgun Gothic" w:hAnsi="Malgun Gothic"/>
+                <w:b/>
+                <w:bCs/>
+                <w:color w:val="FFFFFF"/>
+                <w:sz w:val="19"/>
+                <w:szCs w:val="19"/>
+              </w:rPr>
+              <w:t xml:space="preserve">입력·처리·출력</w:t>
             </w:r>
           </w:p>
         </w:tc>
@@ -387,7 +464,7 @@
                 <w:sz w:val="19"/>
                 <w:szCs w:val="19"/>
               </w:rPr>
-              <w:t xml:space="preserve">전처리</w:t>
+              <w:t xml:space="preserve">데이터 입력·검증</w:t>
             </w:r>
           </w:p>
         </w:tc>
@@ -414,7 +491,7 @@
                 <w:sz w:val="19"/>
                 <w:szCs w:val="19"/>
               </w:rPr>
-              <w:t xml:space="preserve">열 이름 공백 정리, 완전 중복 행 제거, 성별·설문 응답·정답을 숫자로 변환</w:t>
+              <w:t xml:space="preserve">기본 CSV 또는 --data로 지정한 CSV를 읽고 필수 열, 결측값, 허용값을 검사</w:t>
             </w:r>
           </w:p>
         </w:tc>
@@ -443,7 +520,7 @@
                 <w:sz w:val="19"/>
                 <w:szCs w:val="19"/>
               </w:rPr>
-              <w:t xml:space="preserve">학습</w:t>
+              <w:t xml:space="preserve">전처리</w:t>
             </w:r>
           </w:p>
         </w:tc>
@@ -470,7 +547,7 @@
                 <w:sz w:val="19"/>
                 <w:szCs w:val="19"/>
               </w:rPr>
-              <w:t xml:space="preserve">정답 비율을 유지한 80:20 분할 후 학습 데이터에만 표준화 적합; 로지스틱 회귀 학습</w:t>
+              <w:t xml:space="preserve">열 이름 공백 정리, 완전 중복 행 제거, 성별·설문 응답·정답을 숫자로 변환</w:t>
             </w:r>
           </w:p>
         </w:tc>
@@ -499,6 +576,62 @@
                 <w:sz w:val="19"/>
                 <w:szCs w:val="19"/>
               </w:rPr>
+              <w:t xml:space="preserve">학습</w:t>
+            </w:r>
+          </w:p>
+        </w:tc>
+        <w:tc>
+          <w:tcPr>
+            <w:tcW w:type="dxa" w:w="7210"/>
+            <w:tcMar>
+              <w:top w:type="dxa" w:w="95"/>
+              <w:left w:type="dxa" w:w="115"/>
+              <w:bottom w:type="dxa" w:w="95"/>
+              <w:right w:type="dxa" w:w="115"/>
+            </w:tcMar>
+          </w:tcPr>
+          <w:p>
+            <w:pPr>
+              <w:spacing w:after="0" w:line="240"/>
+            </w:pPr>
+            <w:r>
+              <w:rPr>
+                <w:rFonts w:ascii="Malgun Gothic" w:cs="Malgun Gothic" w:eastAsia="Malgun Gothic" w:hAnsi="Malgun Gothic"/>
+                <w:b w:val="false"/>
+                <w:bCs w:val="false"/>
+                <w:color w:val="222222"/>
+                <w:sz w:val="19"/>
+                <w:szCs w:val="19"/>
+              </w:rPr>
+              <w:t xml:space="preserve">정답 비율을 유지한 80:20 분할 후 학습 데이터에만 표준화 적합; 로지스틱 회귀 학습</w:t>
+            </w:r>
+          </w:p>
+        </w:tc>
+      </w:tr>
+      <w:tr>
+        <w:tc>
+          <w:tcPr>
+            <w:tcW w:type="dxa" w:w="2150"/>
+            <w:tcMar>
+              <w:top w:type="dxa" w:w="95"/>
+              <w:left w:type="dxa" w:w="115"/>
+              <w:bottom w:type="dxa" w:w="95"/>
+              <w:right w:type="dxa" w:w="115"/>
+            </w:tcMar>
+          </w:tcPr>
+          <w:p>
+            <w:pPr>
+              <w:spacing w:after="0" w:line="240"/>
+            </w:pPr>
+            <w:r>
+              <w:rPr>
+                <w:rFonts w:ascii="Malgun Gothic" w:cs="Malgun Gothic" w:eastAsia="Malgun Gothic" w:hAnsi="Malgun Gothic"/>
+                <w:b w:val="false"/>
+                <w:bCs w:val="false"/>
+                <w:color w:val="222222"/>
+                <w:sz w:val="19"/>
+                <w:szCs w:val="19"/>
+              </w:rPr>
               <w:t xml:space="preserve">평가·저장</w:t>
             </w:r>
           </w:p>
@@ -537,6 +670,15 @@
         <w:pStyle w:val="Normal"/>
         <w:spacing w:after="65" w:before="0" w:line="100"/>
       </w:pPr>
+    </w:p>
+    <w:p>
+      <w:pPr>
+        <w:pStyle w:val="Caption"/>
+        <w:spacing w:after="90" w:before="0" w:line="260"/>
+      </w:pPr>
+      <w:r>
+        <w:t xml:space="preserve">범위: 설문 데이터의 분류 실습이다. 출력값을 실제 폐암 진단이나 개인 의료 판단에 사용하지 않는다.</w:t>
+      </w:r>
     </w:p>
     <w:p>
       <w:pPr>
@@ -556,611 +698,52 @@
         <w:t xml:space="preserve">3. 실행 흐름도</w:t>
       </w:r>
     </w:p>
-    <w:tbl>
-      <w:tblPr>
-        <w:tblW w:type="dxa" w:w="9360"/>
-        <w:tblBorders>
-          <w:top w:val="single" w:color="D4DCE5" w:sz="5"/>
-          <w:left w:val="single" w:color="D4DCE5" w:sz="5"/>
-          <w:bottom w:val="single" w:color="D4DCE5" w:sz="5"/>
-          <w:right w:val="single" w:color="D4DCE5" w:sz="5"/>
-          <w:insideH w:val="single" w:color="D4DCE5" w:sz="4"/>
-          <w:insideV w:val="single" w:color="D4DCE5" w:sz="4"/>
-        </w:tblBorders>
-      </w:tblPr>
-      <w:tblGrid>
-        <w:gridCol w:w="750"/>
-        <w:gridCol w:w="5520"/>
-        <w:gridCol w:w="3090"/>
-      </w:tblGrid>
-      <w:tr>
-        <w:trPr>
-          <w:tblHeader/>
-        </w:trPr>
-        <w:tc>
-          <w:tcPr>
-            <w:tcW w:type="dxa" w:w="750"/>
-            <w:shd w:fill="17365D" w:val="clear"/>
-            <w:tcMar>
-              <w:top w:type="dxa" w:w="95"/>
-              <w:left w:type="dxa" w:w="115"/>
-              <w:bottom w:type="dxa" w:w="95"/>
-              <w:right w:type="dxa" w:w="115"/>
-            </w:tcMar>
-          </w:tcPr>
-          <w:p>
-            <w:pPr>
-              <w:spacing w:after="0" w:line="240"/>
-            </w:pPr>
-            <w:r>
-              <w:rPr>
-                <w:rFonts w:ascii="Malgun Gothic" w:cs="Malgun Gothic" w:eastAsia="Malgun Gothic" w:hAnsi="Malgun Gothic"/>
-                <w:b/>
-                <w:bCs/>
-                <w:color w:val="FFFFFF"/>
-                <w:sz w:val="19"/>
-                <w:szCs w:val="19"/>
-              </w:rPr>
-              <w:t xml:space="preserve">순서</w:t>
-            </w:r>
-          </w:p>
-        </w:tc>
-        <w:tc>
-          <w:tcPr>
-            <w:tcW w:type="dxa" w:w="5520"/>
-            <w:shd w:fill="17365D" w:val="clear"/>
-            <w:tcMar>
-              <w:top w:type="dxa" w:w="95"/>
-              <w:left w:type="dxa" w:w="115"/>
-              <w:bottom w:type="dxa" w:w="95"/>
-              <w:right w:type="dxa" w:w="115"/>
-            </w:tcMar>
-          </w:tcPr>
-          <w:p>
-            <w:pPr>
-              <w:spacing w:after="0" w:line="240"/>
-            </w:pPr>
-            <w:r>
-              <w:rPr>
-                <w:rFonts w:ascii="Malgun Gothic" w:cs="Malgun Gothic" w:eastAsia="Malgun Gothic" w:hAnsi="Malgun Gothic"/>
-                <w:b/>
-                <w:bCs/>
-                <w:color w:val="FFFFFF"/>
-                <w:sz w:val="19"/>
-                <w:szCs w:val="19"/>
-              </w:rPr>
-              <w:t xml:space="preserve">처리 흐름</w:t>
-            </w:r>
-          </w:p>
-        </w:tc>
-        <w:tc>
-          <w:tcPr>
-            <w:tcW w:type="dxa" w:w="3090"/>
-            <w:shd w:fill="17365D" w:val="clear"/>
-            <w:tcMar>
-              <w:top w:type="dxa" w:w="95"/>
-              <w:left w:type="dxa" w:w="115"/>
-              <w:bottom w:type="dxa" w:w="95"/>
-              <w:right w:type="dxa" w:w="115"/>
-            </w:tcMar>
-          </w:tcPr>
-          <w:p>
-            <w:pPr>
-              <w:spacing w:after="0" w:line="240"/>
-            </w:pPr>
-            <w:r>
-              <w:rPr>
-                <w:rFonts w:ascii="Malgun Gothic" w:cs="Malgun Gothic" w:eastAsia="Malgun Gothic" w:hAnsi="Malgun Gothic"/>
-                <w:b/>
-                <w:bCs/>
-                <w:color w:val="FFFFFF"/>
-                <w:sz w:val="19"/>
-                <w:szCs w:val="19"/>
-              </w:rPr>
-              <w:t xml:space="preserve">확인할 결과</w:t>
-            </w:r>
-          </w:p>
-        </w:tc>
-      </w:tr>
-      <w:tr>
-        <w:tc>
-          <w:tcPr>
-            <w:tcW w:type="dxa" w:w="750"/>
-            <w:tcMar>
-              <w:top w:type="dxa" w:w="95"/>
-              <w:left w:type="dxa" w:w="115"/>
-              <w:bottom w:type="dxa" w:w="95"/>
-              <w:right w:type="dxa" w:w="115"/>
-            </w:tcMar>
-          </w:tcPr>
-          <w:p>
-            <w:pPr>
-              <w:spacing w:after="0" w:line="240"/>
-            </w:pPr>
-            <w:r>
-              <w:rPr>
-                <w:rFonts w:ascii="Malgun Gothic" w:cs="Malgun Gothic" w:eastAsia="Malgun Gothic" w:hAnsi="Malgun Gothic"/>
-                <w:b w:val="false"/>
-                <w:bCs w:val="false"/>
-                <w:color w:val="222222"/>
-                <w:sz w:val="19"/>
-                <w:szCs w:val="19"/>
-              </w:rPr>
-              <w:t xml:space="preserve">①</w:t>
-            </w:r>
-          </w:p>
-        </w:tc>
-        <w:tc>
-          <w:tcPr>
-            <w:tcW w:type="dxa" w:w="5520"/>
-            <w:tcMar>
-              <w:top w:type="dxa" w:w="95"/>
-              <w:left w:type="dxa" w:w="115"/>
-              <w:bottom w:type="dxa" w:w="95"/>
-              <w:right w:type="dxa" w:w="115"/>
-            </w:tcMar>
-          </w:tcPr>
-          <w:p>
-            <w:pPr>
-              <w:spacing w:after="0" w:line="240"/>
-            </w:pPr>
-            <w:r>
-              <w:rPr>
-                <w:rFonts w:ascii="Malgun Gothic" w:cs="Malgun Gothic" w:eastAsia="Malgun Gothic" w:hAnsi="Malgun Gothic"/>
-                <w:b w:val="false"/>
-                <w:bCs w:val="false"/>
-                <w:color w:val="222222"/>
-                <w:sz w:val="19"/>
-                <w:szCs w:val="19"/>
-              </w:rPr>
-              <w:t xml:space="preserve">CSV 불러오기 → 열·값·결측 검증</w:t>
-            </w:r>
-          </w:p>
-        </w:tc>
-        <w:tc>
-          <w:tcPr>
-            <w:tcW w:type="dxa" w:w="3090"/>
-            <w:tcMar>
-              <w:top w:type="dxa" w:w="95"/>
-              <w:left w:type="dxa" w:w="115"/>
-              <w:bottom w:type="dxa" w:w="95"/>
-              <w:right w:type="dxa" w:w="115"/>
-            </w:tcMar>
-          </w:tcPr>
-          <w:p>
-            <w:pPr>
-              <w:spacing w:after="0" w:line="240"/>
-            </w:pPr>
-            <w:r>
-              <w:rPr>
-                <w:rFonts w:ascii="Malgun Gothic" w:cs="Malgun Gothic" w:eastAsia="Malgun Gothic" w:hAnsi="Malgun Gothic"/>
-                <w:b w:val="false"/>
-                <w:bCs w:val="false"/>
-                <w:color w:val="222222"/>
-                <w:sz w:val="19"/>
-                <w:szCs w:val="19"/>
-              </w:rPr>
-              <w:t xml:space="preserve">형식 오류 시 원인 표시</w:t>
-            </w:r>
-          </w:p>
-        </w:tc>
-      </w:tr>
-      <w:tr>
-        <w:tc>
-          <w:tcPr>
-            <w:tcW w:type="dxa" w:w="750"/>
-            <w:tcMar>
-              <w:top w:type="dxa" w:w="95"/>
-              <w:left w:type="dxa" w:w="115"/>
-              <w:bottom w:type="dxa" w:w="95"/>
-              <w:right w:type="dxa" w:w="115"/>
-            </w:tcMar>
-          </w:tcPr>
-          <w:p>
-            <w:pPr>
-              <w:spacing w:after="0" w:line="240"/>
-            </w:pPr>
-            <w:r>
-              <w:rPr>
-                <w:rFonts w:ascii="Malgun Gothic" w:cs="Malgun Gothic" w:eastAsia="Malgun Gothic" w:hAnsi="Malgun Gothic"/>
-                <w:b w:val="false"/>
-                <w:bCs w:val="false"/>
-                <w:color w:val="222222"/>
-                <w:sz w:val="19"/>
-                <w:szCs w:val="19"/>
-              </w:rPr>
-              <w:t xml:space="preserve">②</w:t>
-            </w:r>
-          </w:p>
-        </w:tc>
-        <w:tc>
-          <w:tcPr>
-            <w:tcW w:type="dxa" w:w="5520"/>
-            <w:tcMar>
-              <w:top w:type="dxa" w:w="95"/>
-              <w:left w:type="dxa" w:w="115"/>
-              <w:bottom w:type="dxa" w:w="95"/>
-              <w:right w:type="dxa" w:w="115"/>
-            </w:tcMar>
-          </w:tcPr>
-          <w:p>
-            <w:pPr>
-              <w:spacing w:after="0" w:line="240"/>
-            </w:pPr>
-            <w:r>
-              <w:rPr>
-                <w:rFonts w:ascii="Malgun Gothic" w:cs="Malgun Gothic" w:eastAsia="Malgun Gothic" w:hAnsi="Malgun Gothic"/>
-                <w:b w:val="false"/>
-                <w:bCs w:val="false"/>
-                <w:color w:val="222222"/>
-                <w:sz w:val="19"/>
-                <w:szCs w:val="19"/>
-              </w:rPr>
-              <w:t xml:space="preserve">중복 제거 → 범주값 숫자 변환</w:t>
-            </w:r>
-          </w:p>
-        </w:tc>
-        <w:tc>
-          <w:tcPr>
-            <w:tcW w:type="dxa" w:w="3090"/>
-            <w:tcMar>
-              <w:top w:type="dxa" w:w="95"/>
-              <w:left w:type="dxa" w:w="115"/>
-              <w:bottom w:type="dxa" w:w="95"/>
-              <w:right w:type="dxa" w:w="115"/>
-            </w:tcMar>
-          </w:tcPr>
-          <w:p>
-            <w:pPr>
-              <w:spacing w:after="0" w:line="240"/>
-            </w:pPr>
-            <w:r>
-              <w:rPr>
-                <w:rFonts w:ascii="Malgun Gothic" w:cs="Malgun Gothic" w:eastAsia="Malgun Gothic" w:hAnsi="Malgun Gothic"/>
-                <w:b w:val="false"/>
-                <w:bCs w:val="false"/>
-                <w:color w:val="222222"/>
-                <w:sz w:val="19"/>
-                <w:szCs w:val="19"/>
-              </w:rPr>
-              <w:t xml:space="preserve">학습 가능한 특성·정답</w:t>
-            </w:r>
-          </w:p>
-        </w:tc>
-      </w:tr>
-      <w:tr>
-        <w:tc>
-          <w:tcPr>
-            <w:tcW w:type="dxa" w:w="750"/>
-            <w:tcMar>
-              <w:top w:type="dxa" w:w="95"/>
-              <w:left w:type="dxa" w:w="115"/>
-              <w:bottom w:type="dxa" w:w="95"/>
-              <w:right w:type="dxa" w:w="115"/>
-            </w:tcMar>
-          </w:tcPr>
-          <w:p>
-            <w:pPr>
-              <w:spacing w:after="0" w:line="240"/>
-            </w:pPr>
-            <w:r>
-              <w:rPr>
-                <w:rFonts w:ascii="Malgun Gothic" w:cs="Malgun Gothic" w:eastAsia="Malgun Gothic" w:hAnsi="Malgun Gothic"/>
-                <w:b w:val="false"/>
-                <w:bCs w:val="false"/>
-                <w:color w:val="222222"/>
-                <w:sz w:val="19"/>
-                <w:szCs w:val="19"/>
-              </w:rPr>
-              <w:t xml:space="preserve">③</w:t>
-            </w:r>
-          </w:p>
-        </w:tc>
-        <w:tc>
-          <w:tcPr>
-            <w:tcW w:type="dxa" w:w="5520"/>
-            <w:tcMar>
-              <w:top w:type="dxa" w:w="95"/>
-              <w:left w:type="dxa" w:w="115"/>
-              <w:bottom w:type="dxa" w:w="95"/>
-              <w:right w:type="dxa" w:w="115"/>
-            </w:tcMar>
-          </w:tcPr>
-          <w:p>
-            <w:pPr>
-              <w:spacing w:after="0" w:line="240"/>
-            </w:pPr>
-            <w:r>
-              <w:rPr>
-                <w:rFonts w:ascii="Malgun Gothic" w:cs="Malgun Gothic" w:eastAsia="Malgun Gothic" w:hAnsi="Malgun Gothic"/>
-                <w:b w:val="false"/>
-                <w:bCs w:val="false"/>
-                <w:color w:val="222222"/>
-                <w:sz w:val="19"/>
-                <w:szCs w:val="19"/>
-              </w:rPr>
-              <w:t xml:space="preserve">정답 비율 유지 80:20 분할</w:t>
-            </w:r>
-          </w:p>
-        </w:tc>
-        <w:tc>
-          <w:tcPr>
-            <w:tcW w:type="dxa" w:w="3090"/>
-            <w:tcMar>
-              <w:top w:type="dxa" w:w="95"/>
-              <w:left w:type="dxa" w:w="115"/>
-              <w:bottom w:type="dxa" w:w="95"/>
-              <w:right w:type="dxa" w:w="115"/>
-            </w:tcMar>
-          </w:tcPr>
-          <w:p>
-            <w:pPr>
-              <w:spacing w:after="0" w:line="240"/>
-            </w:pPr>
-            <w:r>
-              <w:rPr>
-                <w:rFonts w:ascii="Malgun Gothic" w:cs="Malgun Gothic" w:eastAsia="Malgun Gothic" w:hAnsi="Malgun Gothic"/>
-                <w:b w:val="false"/>
-                <w:bCs w:val="false"/>
-                <w:color w:val="222222"/>
-                <w:sz w:val="19"/>
-                <w:szCs w:val="19"/>
-              </w:rPr>
-              <w:t xml:space="preserve">학습·평가 데이터 분리</w:t>
-            </w:r>
-          </w:p>
-        </w:tc>
-      </w:tr>
-      <w:tr>
-        <w:tc>
-          <w:tcPr>
-            <w:tcW w:type="dxa" w:w="750"/>
-            <w:tcMar>
-              <w:top w:type="dxa" w:w="95"/>
-              <w:left w:type="dxa" w:w="115"/>
-              <w:bottom w:type="dxa" w:w="95"/>
-              <w:right w:type="dxa" w:w="115"/>
-            </w:tcMar>
-          </w:tcPr>
-          <w:p>
-            <w:pPr>
-              <w:spacing w:after="0" w:line="240"/>
-            </w:pPr>
-            <w:r>
-              <w:rPr>
-                <w:rFonts w:ascii="Malgun Gothic" w:cs="Malgun Gothic" w:eastAsia="Malgun Gothic" w:hAnsi="Malgun Gothic"/>
-                <w:b w:val="false"/>
-                <w:bCs w:val="false"/>
-                <w:color w:val="222222"/>
-                <w:sz w:val="19"/>
-                <w:szCs w:val="19"/>
-              </w:rPr>
-              <w:t xml:space="preserve">④</w:t>
-            </w:r>
-          </w:p>
-        </w:tc>
-        <w:tc>
-          <w:tcPr>
-            <w:tcW w:type="dxa" w:w="5520"/>
-            <w:tcMar>
-              <w:top w:type="dxa" w:w="95"/>
-              <w:left w:type="dxa" w:w="115"/>
-              <w:bottom w:type="dxa" w:w="95"/>
-              <w:right w:type="dxa" w:w="115"/>
-            </w:tcMar>
-          </w:tcPr>
-          <w:p>
-            <w:pPr>
-              <w:spacing w:after="0" w:line="240"/>
-            </w:pPr>
-            <w:r>
-              <w:rPr>
-                <w:rFonts w:ascii="Malgun Gothic" w:cs="Malgun Gothic" w:eastAsia="Malgun Gothic" w:hAnsi="Malgun Gothic"/>
-                <w:b w:val="false"/>
-                <w:bCs w:val="false"/>
-                <w:color w:val="222222"/>
-                <w:sz w:val="19"/>
-                <w:szCs w:val="19"/>
-              </w:rPr>
-              <w:t xml:space="preserve">학습 데이터에서 표준화 → 로지스틱 회귀 학습</w:t>
-            </w:r>
-          </w:p>
-        </w:tc>
-        <w:tc>
-          <w:tcPr>
-            <w:tcW w:type="dxa" w:w="3090"/>
-            <w:tcMar>
-              <w:top w:type="dxa" w:w="95"/>
-              <w:left w:type="dxa" w:w="115"/>
-              <w:bottom w:type="dxa" w:w="95"/>
-              <w:right w:type="dxa" w:w="115"/>
-            </w:tcMar>
-          </w:tcPr>
-          <w:p>
-            <w:pPr>
-              <w:spacing w:after="0" w:line="240"/>
-            </w:pPr>
-            <w:r>
-              <w:rPr>
-                <w:rFonts w:ascii="Malgun Gothic" w:cs="Malgun Gothic" w:eastAsia="Malgun Gothic" w:hAnsi="Malgun Gothic"/>
-                <w:b w:val="false"/>
-                <w:bCs w:val="false"/>
-                <w:color w:val="222222"/>
-                <w:sz w:val="19"/>
-                <w:szCs w:val="19"/>
-              </w:rPr>
-              <w:t xml:space="preserve">학습된 분류 모델</w:t>
-            </w:r>
-          </w:p>
-        </w:tc>
-      </w:tr>
-      <w:tr>
-        <w:tc>
-          <w:tcPr>
-            <w:tcW w:type="dxa" w:w="750"/>
-            <w:tcMar>
-              <w:top w:type="dxa" w:w="95"/>
-              <w:left w:type="dxa" w:w="115"/>
-              <w:bottom w:type="dxa" w:w="95"/>
-              <w:right w:type="dxa" w:w="115"/>
-            </w:tcMar>
-          </w:tcPr>
-          <w:p>
-            <w:pPr>
-              <w:spacing w:after="0" w:line="240"/>
-            </w:pPr>
-            <w:r>
-              <w:rPr>
-                <w:rFonts w:ascii="Malgun Gothic" w:cs="Malgun Gothic" w:eastAsia="Malgun Gothic" w:hAnsi="Malgun Gothic"/>
-                <w:b w:val="false"/>
-                <w:bCs w:val="false"/>
-                <w:color w:val="222222"/>
-                <w:sz w:val="19"/>
-                <w:szCs w:val="19"/>
-              </w:rPr>
-              <w:t xml:space="preserve">⑤</w:t>
-            </w:r>
-          </w:p>
-        </w:tc>
-        <w:tc>
-          <w:tcPr>
-            <w:tcW w:type="dxa" w:w="5520"/>
-            <w:tcMar>
-              <w:top w:type="dxa" w:w="95"/>
-              <w:left w:type="dxa" w:w="115"/>
-              <w:bottom w:type="dxa" w:w="95"/>
-              <w:right w:type="dxa" w:w="115"/>
-            </w:tcMar>
-          </w:tcPr>
-          <w:p>
-            <w:pPr>
-              <w:spacing w:after="0" w:line="240"/>
-            </w:pPr>
-            <w:r>
-              <w:rPr>
-                <w:rFonts w:ascii="Malgun Gothic" w:cs="Malgun Gothic" w:eastAsia="Malgun Gothic" w:hAnsi="Malgun Gothic"/>
-                <w:b w:val="false"/>
-                <w:bCs w:val="false"/>
-                <w:color w:val="222222"/>
-                <w:sz w:val="19"/>
-                <w:szCs w:val="19"/>
-              </w:rPr>
-              <w:t xml:space="preserve">평가 데이터 예측 → 지표 계산</w:t>
-            </w:r>
-          </w:p>
-        </w:tc>
-        <w:tc>
-          <w:tcPr>
-            <w:tcW w:type="dxa" w:w="3090"/>
-            <w:tcMar>
-              <w:top w:type="dxa" w:w="95"/>
-              <w:left w:type="dxa" w:w="115"/>
-              <w:bottom w:type="dxa" w:w="95"/>
-              <w:right w:type="dxa" w:w="115"/>
-            </w:tcMar>
-          </w:tcPr>
-          <w:p>
-            <w:pPr>
-              <w:spacing w:after="0" w:line="240"/>
-            </w:pPr>
-            <w:r>
-              <w:rPr>
-                <w:rFonts w:ascii="Malgun Gothic" w:cs="Malgun Gothic" w:eastAsia="Malgun Gothic" w:hAnsi="Malgun Gothic"/>
-                <w:b w:val="false"/>
-                <w:bCs w:val="false"/>
-                <w:color w:val="222222"/>
-                <w:sz w:val="19"/>
-                <w:szCs w:val="19"/>
-              </w:rPr>
-              <w:t xml:space="preserve">성능 수치·혼동 행렬</w:t>
-            </w:r>
-          </w:p>
-        </w:tc>
-      </w:tr>
-      <w:tr>
-        <w:tc>
-          <w:tcPr>
-            <w:tcW w:type="dxa" w:w="750"/>
-            <w:tcMar>
-              <w:top w:type="dxa" w:w="95"/>
-              <w:left w:type="dxa" w:w="115"/>
-              <w:bottom w:type="dxa" w:w="95"/>
-              <w:right w:type="dxa" w:w="115"/>
-            </w:tcMar>
-          </w:tcPr>
-          <w:p>
-            <w:pPr>
-              <w:spacing w:after="0" w:line="240"/>
-            </w:pPr>
-            <w:r>
-              <w:rPr>
-                <w:rFonts w:ascii="Malgun Gothic" w:cs="Malgun Gothic" w:eastAsia="Malgun Gothic" w:hAnsi="Malgun Gothic"/>
-                <w:b w:val="false"/>
-                <w:bCs w:val="false"/>
-                <w:color w:val="222222"/>
-                <w:sz w:val="19"/>
-                <w:szCs w:val="19"/>
-              </w:rPr>
-              <w:t xml:space="preserve">⑥</w:t>
-            </w:r>
-          </w:p>
-        </w:tc>
-        <w:tc>
-          <w:tcPr>
-            <w:tcW w:type="dxa" w:w="5520"/>
-            <w:tcMar>
-              <w:top w:type="dxa" w:w="95"/>
-              <w:left w:type="dxa" w:w="115"/>
-              <w:bottom w:type="dxa" w:w="95"/>
-              <w:right w:type="dxa" w:w="115"/>
-            </w:tcMar>
-          </w:tcPr>
-          <w:p>
-            <w:pPr>
-              <w:spacing w:after="0" w:line="240"/>
-            </w:pPr>
-            <w:r>
-              <w:rPr>
-                <w:rFonts w:ascii="Malgun Gothic" w:cs="Malgun Gothic" w:eastAsia="Malgun Gothic" w:hAnsi="Malgun Gothic"/>
-                <w:b w:val="false"/>
-                <w:bCs w:val="false"/>
-                <w:color w:val="222222"/>
-                <w:sz w:val="19"/>
-                <w:szCs w:val="19"/>
-              </w:rPr>
-              <w:t xml:space="preserve">artifacts/에 결과 저장</w:t>
-            </w:r>
-          </w:p>
-        </w:tc>
-        <w:tc>
-          <w:tcPr>
-            <w:tcW w:type="dxa" w:w="3090"/>
-            <w:tcMar>
-              <w:top w:type="dxa" w:w="95"/>
-              <w:left w:type="dxa" w:w="115"/>
-              <w:bottom w:type="dxa" w:w="95"/>
-              <w:right w:type="dxa" w:w="115"/>
-            </w:tcMar>
-          </w:tcPr>
-          <w:p>
-            <w:pPr>
-              <w:spacing w:after="0" w:line="240"/>
-            </w:pPr>
-            <w:r>
-              <w:rPr>
-                <w:rFonts w:ascii="Malgun Gothic" w:cs="Malgun Gothic" w:eastAsia="Malgun Gothic" w:hAnsi="Malgun Gothic"/>
-                <w:b w:val="false"/>
-                <w:bCs w:val="false"/>
-                <w:color w:val="222222"/>
-                <w:sz w:val="19"/>
-                <w:szCs w:val="19"/>
-              </w:rPr>
-              <w:t xml:space="preserve">metrics.json, model.joblib</w:t>
-            </w:r>
-          </w:p>
-        </w:tc>
-      </w:tr>
-    </w:tbl>
+    <w:p>
+      <w:pPr>
+        <w:spacing w:after="90"/>
+        <w:jc w:val="center"/>
+      </w:pPr>
+      <w:r>
+        <w:drawing>
+          <wp:inline distT="0" distB="0" distL="0" distR="0">
+            <wp:extent cx="6000750" cy="2266950"/>
+            <wp:effectExtent t="0" r="0" b="0" l="0"/>
+            <wp:docPr id="1" name="" descr="" title=""/>
+            <wp:cNvGraphicFramePr>
+              <a:graphicFrameLocks xmlns:a="http://schemas.openxmlformats.org/drawingml/2006/main" noChangeAspect="1"/>
+            </wp:cNvGraphicFramePr>
+            <a:graphic xmlns:a="http://schemas.openxmlformats.org/drawingml/2006/main">
+              <a:graphicData uri="http://schemas.openxmlformats.org/drawingml/2006/picture">
+                <pic:pic xmlns:pic="http://schemas.openxmlformats.org/drawingml/2006/picture">
+                  <pic:nvPicPr>
+                    <pic:cNvPr id="0" name="" descr=""/>
+                    <pic:cNvPicPr>
+                      <a:picLocks noChangeAspect="1" noChangeArrowheads="1"/>
+                    </pic:cNvPicPr>
+                  </pic:nvPicPr>
+                  <pic:blipFill>
+                    <a:blip r:embed="rId9" cstate="none"/>
+                    <a:srcRect/>
+                    <a:stretch>
+                      <a:fillRect/>
+                    </a:stretch>
+                  </pic:blipFill>
+                  <pic:spPr bwMode="auto">
+                    <a:xfrm>
+                      <a:off x="0" y="0"/>
+                      <a:ext cx="6000750" cy="2266950"/>
+                    </a:xfrm>
+                    <a:prstGeom prst="rect">
+                      <a:avLst/>
+                    </a:prstGeom>
+                  </pic:spPr>
+                </pic:pic>
+              </a:graphicData>
+            </a:graphic>
+          </wp:inline>
+        </w:drawing>
+      </w:r>
+    </w:p>
     <w:p>
       <w:pPr>
         <w:pStyle w:val="Heading 1"/>
@@ -1299,7 +882,7 @@
                 <w:sz w:val="19"/>
                 <w:szCs w:val="19"/>
               </w:rPr>
-              <w:t xml:space="preserve">data/lung_cancer.csv; 정답 열 LUNG_CANCER(YES/NO)</w:t>
+              <w:t xml:space="preserve">Kaggle “Lung Cancer” 설문 CSV; 정답 열 LUNG_CANCER(YES/NO)</w:t>
             </w:r>
           </w:p>
         </w:tc>
@@ -1468,62 +1051,6 @@
                 <w:szCs w:val="19"/>
               </w:rPr>
               <w:t xml:space="preserve">StandardScaler + LogisticRegression(class_weight="balanced", random_state=42)</w:t>
-            </w:r>
-          </w:p>
-        </w:tc>
-      </w:tr>
-      <w:tr>
-        <w:tc>
-          <w:tcPr>
-            <w:tcW w:type="dxa" w:w="2100"/>
-            <w:tcMar>
-              <w:top w:type="dxa" w:w="95"/>
-              <w:left w:type="dxa" w:w="115"/>
-              <w:bottom w:type="dxa" w:w="95"/>
-              <w:right w:type="dxa" w:w="115"/>
-            </w:tcMar>
-          </w:tcPr>
-          <w:p>
-            <w:pPr>
-              <w:spacing w:after="0" w:line="240"/>
-            </w:pPr>
-            <w:r>
-              <w:rPr>
-                <w:rFonts w:ascii="Malgun Gothic" w:cs="Malgun Gothic" w:eastAsia="Malgun Gothic" w:hAnsi="Malgun Gothic"/>
-                <w:b w:val="false"/>
-                <w:bCs w:val="false"/>
-                <w:color w:val="222222"/>
-                <w:sz w:val="19"/>
-                <w:szCs w:val="19"/>
-              </w:rPr>
-              <w:t xml:space="preserve">개발 환경</w:t>
-            </w:r>
-          </w:p>
-        </w:tc>
-        <w:tc>
-          <w:tcPr>
-            <w:tcW w:type="dxa" w:w="7260"/>
-            <w:tcMar>
-              <w:top w:type="dxa" w:w="95"/>
-              <w:left w:type="dxa" w:w="115"/>
-              <w:bottom w:type="dxa" w:w="95"/>
-              <w:right w:type="dxa" w:w="115"/>
-            </w:tcMar>
-          </w:tcPr>
-          <w:p>
-            <w:pPr>
-              <w:spacing w:after="0" w:line="240"/>
-            </w:pPr>
-            <w:r>
-              <w:rPr>
-                <w:rFonts w:ascii="Malgun Gothic" w:cs="Malgun Gothic" w:eastAsia="Malgun Gothic" w:hAnsi="Malgun Gothic"/>
-                <w:b w:val="false"/>
-                <w:bCs w:val="false"/>
-                <w:color w:val="222222"/>
-                <w:sz w:val="19"/>
-                <w:szCs w:val="19"/>
-              </w:rPr>
-              <w:t xml:space="preserve">Python 3.10 이상, pandas 2.x, scikit-learn 1.x, joblib 1.x</w:t>
             </w:r>
           </w:p>
         </w:tc>
@@ -1592,7 +1119,35 @@
         <w:spacing w:after="100" w:before="210" w:line="260"/>
       </w:pPr>
       <w:r>
-        <w:t xml:space="preserve">5. 검증 기준</w:t>
+        <w:t xml:space="preserve">5. 개발 환경 및 검증 기준</w:t>
+      </w:r>
+    </w:p>
+    <w:p>
+      <w:pPr>
+        <w:pStyle w:val="ListParagraph"/>
+        <w:pStyle w:val="Normal"/>
+        <w:numPr>
+          <w:ilvl w:val="0"/>
+          <w:numId w:val="1"/>
+        </w:numPr>
+        <w:spacing w:after="55" w:line="245"/>
+      </w:pPr>
+      <w:r>
+        <w:t xml:space="preserve">Python 3.10 이상, pandas 2.x, scikit-learn 1.x, joblib 1.x; Windows PowerShell 또는 macOS/Linux 터미널.</w:t>
+      </w:r>
+    </w:p>
+    <w:p>
+      <w:pPr>
+        <w:pStyle w:val="ListParagraph"/>
+        <w:pStyle w:val="Normal"/>
+        <w:numPr>
+          <w:ilvl w:val="0"/>
+          <w:numId w:val="1"/>
+        </w:numPr>
+        <w:spacing w:after="55" w:line="245"/>
+      </w:pPr>
+      <w:r>
+        <w:t xml:space="preserve">src/train.py를 기본 데이터로 실행하고, --data 옵션으로 다른 CSV도 입력할 수 있게 한다.</w:t>
       </w:r>
     </w:p>
     <w:p>
@@ -2514,6 +2069,16 @@
       </w:pPr>
       <w:r>
         <w:t xml:space="preserve">재현성 문제: 의존성 파일과 실행 방법을 유지하고 최종 제출 전에 다른 PC에서 확인한다.</w:t>
+      </w:r>
+    </w:p>
+    <w:p>
+      <w:pPr>
+        <w:pStyle w:val="Heading 1"/>
+        <w:keepNext/>
+        <w:spacing w:after="100" w:before="210" w:line="260"/>
+      </w:pPr>
+      <w:r>
+        <w:t xml:space="preserve">9. 데이터 출처 및 참고 문헌</w:t>
       </w:r>
     </w:p>
     <w:p>

</xml_diff>

<commit_message>
Redesign proposal workflow as vertical process timeline
</commit_message>
<xml_diff>
--- a/docs/DKU-SWAI_1차_기획서.docx
+++ b/docs/DKU-SWAI_1차_기획서.docx
@@ -706,7 +706,7 @@
       <w:r>
         <w:drawing>
           <wp:inline distT="0" distB="0" distL="0" distR="0">
-            <wp:extent cx="6000750" cy="2266950"/>
+            <wp:extent cx="6000750" cy="2638425"/>
             <wp:effectExtent t="0" r="0" b="0" l="0"/>
             <wp:docPr id="1" name="" descr="" title=""/>
             <wp:cNvGraphicFramePr>
@@ -731,7 +731,7 @@
                   <pic:spPr bwMode="auto">
                     <a:xfrm>
                       <a:off x="0" y="0"/>
-                      <a:ext cx="6000750" cy="2266950"/>
+                      <a:ext cx="6000750" cy="2638425"/>
                     </a:xfrm>
                     <a:prstGeom prst="rect">
                       <a:avLst/>

</xml_diff>